<commit_message>
1.0.5 DEV Prompt Eng: some fixes + otw; Implemented 1 dynamic template field example (testing pending)
</commit_message>
<xml_diff>
--- a/Sisyphus/templates/cv_template_url.docx
+++ b/Sisyphus/templates/cv_template_url.docx
@@ -834,7 +834,7 @@
                 <w:sz w:val="20"/>
                 <w:szCs w:val="20"/>
               </w:rPr>
-              <w:t>{{p.url}}{% for desc in p.description %}</w:t>
+              <w:t>{{if”&lt;&lt;p.url&gt;&gt;”&lt;&gt;”” “&lt;&lt;p.url&gt;&gt;”}}{% for desc in p.description %}</w:t>
             </w:r>
           </w:p>
           <w:p>
@@ -1210,8 +1210,8 @@
       <w:bCs/>
     </w:rPr>
   </w:style>
-  <w:style w:type="character" w:styleId="Bulletsuser">
-    <w:name w:val="Bullets (user)"/>
+  <w:style w:type="character" w:styleId="Bullets">
+    <w:name w:val="Bullets"/>
     <w:qFormat/>
     <w:rPr>
       <w:rFonts w:ascii="OpenSymbol" w:hAnsi="OpenSymbol" w:eastAsia="OpenSymbol" w:cs="OpenSymbol"/>
@@ -1222,8 +1222,8 @@
     <w:qFormat/>
     <w:rPr/>
   </w:style>
-  <w:style w:type="character" w:styleId="Bullets">
-    <w:name w:val="Bullets"/>
+  <w:style w:type="character" w:styleId="Bulletsuser">
+    <w:name w:val="Bullets (user)"/>
     <w:qFormat/>
     <w:rPr>
       <w:rFonts w:ascii="OpenSymbol" w:hAnsi="OpenSymbol" w:eastAsia="OpenSymbol" w:cs="OpenSymbol"/>

</xml_diff>

<commit_message>
1.0.5 DEV Prompt Eng: otw; Fully implemented dynamic templates
</commit_message>
<xml_diff>
--- a/Sisyphus/templates/cv_template_url.docx
+++ b/Sisyphus/templates/cv_template_url.docx
@@ -834,7 +834,15 @@
                 <w:sz w:val="20"/>
                 <w:szCs w:val="20"/>
               </w:rPr>
-              <w:t>{{if”&lt;&lt;p.url&gt;&gt;”&lt;&gt;”” “&lt;&lt;p.url&gt;&gt;”}}{% for desc in p.description %}</w:t>
+              <w:t>{% if p.url %}{{p.url}}{% endif %}</w:t>
+            </w:r>
+            <w:r>
+              <w:rPr>
+                <w:rFonts w:ascii="Times New Roman" w:hAnsi="Times New Roman"/>
+                <w:sz w:val="20"/>
+                <w:szCs w:val="20"/>
+              </w:rPr>
+              <w:t>{% for desc in p.description %}</w:t>
             </w:r>
           </w:p>
           <w:p>
@@ -1210,8 +1218,8 @@
       <w:bCs/>
     </w:rPr>
   </w:style>
-  <w:style w:type="character" w:styleId="Bullets">
-    <w:name w:val="Bullets"/>
+  <w:style w:type="character" w:styleId="Bulletsuser">
+    <w:name w:val="Bullets (user)"/>
     <w:qFormat/>
     <w:rPr>
       <w:rFonts w:ascii="OpenSymbol" w:hAnsi="OpenSymbol" w:eastAsia="OpenSymbol" w:cs="OpenSymbol"/>
@@ -1222,8 +1230,8 @@
     <w:qFormat/>
     <w:rPr/>
   </w:style>
-  <w:style w:type="character" w:styleId="Bulletsuser">
-    <w:name w:val="Bullets (user)"/>
+  <w:style w:type="character" w:styleId="Bullets">
+    <w:name w:val="Bullets"/>
     <w:qFormat/>
     <w:rPr>
       <w:rFonts w:ascii="OpenSymbol" w:hAnsi="OpenSymbol" w:eastAsia="OpenSymbol" w:cs="OpenSymbol"/>

</xml_diff>